<commit_message>
revisa abertura e prepara Entrega 1
</commit_message>
<xml_diff>
--- a/04-ENTREGAS-PARA-REVISAO/ENTREGA-00/Fuga_Identitaria_Entrega_00_Abertura.docx
+++ b/04-ENTREGAS-PARA-REVISAO/ENTREGA-00/Fuga_Identitaria_Entrega_00_Abertura.docx
@@ -1714,7 +1714,7 @@
           <w:color w:val="20242B"/>
           <w:sz w:val="20"/>
         </w:rPr>
-        <w:t>Autoria não significa inventar a si mesmo do nada. Significa poder examinar o que recebeu, conservar o que reconhece como verdadeiro, recusar o que o diminui, revisar o que deixou de fazer sentido e responder pelas consequências do que escolhe. Uma pessoa autora não é uma pessoa que nunca muda. É alguém que não precisa desaparecer para mudar.</w:t>
+        <w:t>Autoria não significa inventar a si mesmo do nada. Significa poder examinar o que recebeu, conservar o que reconhece como verdadeiro, recusar o que produz apagamento, revisar o que deixou de fazer sentido e responder pelas consequências do que escolhe. Uma pessoa autora não é uma pessoa que nunca muda. É alguém que não precisa desaparecer para mudar.</w:t>
       </w:r>
     </w:p>
     <w:p>
@@ -2039,7 +2039,7 @@
           <w:color w:val="20242B"/>
           <w:sz w:val="20"/>
         </w:rPr>
-        <w:t>No pertencimento saudável, você pode entrar inteiro. O vínculo acrescenta linguagem, experiência, correção, afeto e perspectiva, mas não exige que você entregue o direito de examinar. Você pode concordar sem se fundir. Pode discordar sem deixar de existir. Pode mudar de ideia sem perder toda a estrutura interna. Pode sair e sofrer a perda do vínculo sem perder junto a própria identidade.</w:t>
+        <w:t>No pertencimento saudável, você pode entrar por inteiro. O vínculo acrescenta linguagem, experiência, correção, afeto e perspectiva, mas não exige que você entregue o direito de examinar. Você pode concordar sem se fundir. Pode discordar sem deixar de existir. Pode mudar de ideia sem perder toda a estrutura interna. Pode sair e sofrer a perda do vínculo sem perder junto a própria identidade.</w:t>
       </w:r>
     </w:p>
     <w:p>
@@ -2069,7 +2069,7 @@
           <w:color w:val="20242B"/>
           <w:sz w:val="20"/>
         </w:rPr>
-        <w:t>Uma fonte externa — um grupo, um relacionamento, uma liderança, uma causa, uma comunidade, uma audiência ou um sistema de recomendação — encontra uma região sem nome: uma dúvida, uma dor, uma solidão, uma injustiça, um ressentimento ou uma necessidade de reconhecimento. Então oferece um pacote coerente. Explica quem você é, quem o feriu, quem deve temer, qual linguagem usar, o que pensar, a quem admirar, contra quem lutar e por que sua existência importa.</w:t>
+        <w:t>Uma fonte externa — um grupo, um relacionamento, uma liderança, uma causa, uma comunidade, uma audiência ou um sistema de recomendação — encontra uma região sem nome: uma dúvida, uma dor, uma solidão, uma injustiça, um ressentimento ou uma necessidade de reconhecimento. Então oferece um pacote coerente. Explica quem você é, quem feriu você, quem você deve temer, qual linguagem usar, o que pensar, a quem admirar, contra quem lutar e por que sua existência importa.</w:t>
       </w:r>
     </w:p>
     <w:p>
@@ -2224,7 +2224,7 @@
           <w:color w:val="20242B"/>
           <w:sz w:val="20"/>
         </w:rPr>
-        <w:t>O algoritmo não precisa saber quem você é; basta aprender o que interrompe o movimento do seu dedo. O influenciador não precisa conhecer sua história inteira; basta nomear uma dor que faça você se sentir visto. O grupo não precisa acolher tudo o que você é; basta oferecer pertencimento à parte de você que confirma sua narrativa.</w:t>
+        <w:t>O algoritmo não precisa saber quem você é; basta aprender o que interrompe o movimento do seu dedo. O influenciador não precisa conhecer sua história inteira; basta nomear uma dor e produzir a sensação de reconhecimento. O grupo não precisa acolher tudo o que você é; basta oferecer pertencimento à parte de você que confirma sua narrativa.</w:t>
       </w:r>
     </w:p>
     <w:p>
@@ -2525,7 +2525,7 @@
           <w:color w:val="20242B"/>
           <w:sz w:val="20"/>
         </w:rPr>
-        <w:t>Talvez você tenha chegado até aqui esperando que este livro lhe ajude a descobrir quem é. Preciso ser honesta: não tenho o direito de lhe dar essa resposta.</w:t>
+        <w:t>Talvez você tenha chegado até aqui esperando que este livro ajude você a descobrir quem você é. Preciso ser honesta: não tenho o direito de lhe dar essa resposta.</w:t>
       </w:r>
     </w:p>
     <w:p>
@@ -2555,7 +2555,7 @@
           <w:color w:val="20242B"/>
           <w:sz w:val="20"/>
         </w:rPr>
-        <w:t>O que posso fazer é ajudá-lo a perceber quem vem respondendo por você.</w:t>
+        <w:t>O que posso fazer é ajudar você a perceber quem vem respondendo por você.</w:t>
       </w:r>
     </w:p>
     <w:p>
@@ -2645,7 +2645,7 @@
           <w:color w:val="20242B"/>
           <w:sz w:val="20"/>
         </w:rPr>
-        <w:t>Não faremos essa travessia para arrancá-lo de todo vínculo.</w:t>
+        <w:t>Não faremos essa travessia para arrancar você de todo vínculo.</w:t>
       </w:r>
     </w:p>
     <w:p>
@@ -2660,7 +2660,7 @@
           <w:color w:val="20242B"/>
           <w:sz w:val="20"/>
         </w:rPr>
-        <w:t>Este livro não é contra família, fé, comunidade, tecnologia, movimentos, causas, identidade ou pertencimento. É contra a abdicação silenciosa da autoria. Uma fé que não permite pergunta pode exigir submissão, não convicção. Um movimento que não tolera dúvida pode desejar obediência, não consciência. Um relacionamento que só preserva o vínculo quando você desaparece não preserva amor; preserva uma função. Uma tecnologia que o mantém reagindo sem parar pode conhecer seus padrões sem jamais conhecer sua humanidade.</w:t>
+        <w:t>Este livro não é contra família, fé, comunidade, tecnologia, movimentos, causas, identidade ou pertencimento. É contra a abdicação silenciosa da autoria. Uma fé que não permite pergunta pode exigir submissão, não convicção. Um movimento que não tolera dúvida pode desejar obediência, não consciência. Um relacionamento que só preserva o vínculo quando você desaparece não preserva amor; preserva uma função. Uma tecnologia que mantém você reagindo sem parar pode conhecer seus padrões sem jamais conhecer sua humanidade.</w:t>
       </w:r>
     </w:p>
     <w:p>
@@ -2885,7 +2885,7 @@
           <w:color w:val="20242B"/>
           <w:sz w:val="20"/>
         </w:rPr>
-        <w:t>Vai ajudá-lo a perceber quem vem respondendo por você.</w:t>
+        <w:t>Vai ajudar você a perceber quem vem respondendo por você.</w:t>
       </w:r>
     </w:p>
     <w:p>

</xml_diff>